<commit_message>
Update bio with corrected career order, dates, languages
</commit_message>
<xml_diff>
--- a/public/Background Information.docx
+++ b/public/Background Information.docx
@@ -102,6 +102,27 @@
       <w:r>
         <w:t>orked in London</w:t>
       </w:r>
+      <w:r>
+        <w:t xml:space="preserve"> </w:t>
+      </w:r>
+      <w:r>
+        <w:t>(2005 – 2007)</w:t>
+      </w:r>
+    </w:p>
+    <w:p>
+      <w:pPr>
+        <w:pStyle w:val="ListParagraph"/>
+        <w:numPr>
+          <w:ilvl w:val="0"/>
+          <w:numId w:val="1"/>
+        </w:numPr>
+      </w:pPr>
+      <w:r>
+        <w:t>Then worked in Charlotte</w:t>
+      </w:r>
+      <w:r>
+        <w:t xml:space="preserve"> (2007-2009)</w:t>
+      </w:r>
     </w:p>
     <w:p>
       <w:pPr>
@@ -114,17 +135,20 @@
       <w:r>
         <w:t>Then worked in New York</w:t>
       </w:r>
-    </w:p>
-    <w:p>
-      <w:pPr>
-        <w:pStyle w:val="ListParagraph"/>
-        <w:numPr>
-          <w:ilvl w:val="0"/>
-          <w:numId w:val="1"/>
-        </w:numPr>
-      </w:pPr>
-      <w:r>
-        <w:t>Then worked in Charlotte</w:t>
+      <w:r>
+        <w:t xml:space="preserve"> (2009 – 2016)</w:t>
+      </w:r>
+    </w:p>
+    <w:p>
+      <w:pPr>
+        <w:pStyle w:val="ListParagraph"/>
+        <w:numPr>
+          <w:ilvl w:val="1"/>
+          <w:numId w:val="1"/>
+        </w:numPr>
+      </w:pPr>
+      <w:r>
+        <w:t>He was promoted to partner in NY</w:t>
       </w:r>
     </w:p>
     <w:p>
@@ -226,7 +250,18 @@
         <w:t>Spanish</w:t>
       </w:r>
     </w:p>
-    <w:p/>
+    <w:p>
+      <w:pPr>
+        <w:pStyle w:val="ListParagraph"/>
+        <w:numPr>
+          <w:ilvl w:val="0"/>
+          <w:numId w:val="1"/>
+        </w:numPr>
+      </w:pPr>
+      <w:r>
+        <w:t>Learning Italian and French</w:t>
+      </w:r>
+    </w:p>
     <w:p>
       <w:r>
         <w:t>Other:</w:t>
@@ -283,7 +318,7 @@
         <w:rFonts w:ascii="Aptos" w:eastAsiaTheme="minorHAnsi" w:hAnsi="Aptos" w:cstheme="minorBidi" w:hint="default"/>
       </w:rPr>
     </w:lvl>
-    <w:lvl w:ilvl="1" w:tplc="04090003" w:tentative="1">
+    <w:lvl w:ilvl="1" w:tplc="04090003">
       <w:start w:val="1"/>
       <w:numFmt w:val="bullet"/>
       <w:lvlText w:val="o"/>

</xml_diff>